<commit_message>
Case Flow: Atty. Elijah Thorne; Police Report, Declaration Page and other case terms capitalized
- The attorney is Elijah Thorne (was "Thone") everywhere: the course data, slides, curriculum, the
  Case File, the blueprint, the handout and the 38 case documents that name him (re-rendered;
  his address is ethorne@lshlawgroup.example). The document audit's ban on the archived client's
  name is narrowed to "Elias" so Thorne is allowed.
- Document names and defined case terms take one capitalized form throughout the Case Flow's
  text: Police Report, Declaration Page(s), Causation Letter, Limited Release, Net Sheet, Payer
  Order, Specials, Case Plan, Coverage Matrix, Scheduling Order, Treatment Gap and the rest.
- Curriculum and slide copy regenerated; script versions bumped.

Co-Authored-By: Claude Opus 5.5 <noreply@anthropic.com>
Claude-Session: https://claude.ai/code/session_01So6RsHEAxqg1h82DoqaUJQ
</commit_message>
<xml_diff>
--- a/documents/case-flow/intake/RS_03_LSH_CMS_Intake_Record.docx
+++ b/documents/case-flow/intake/RS_03_LSH_CMS_Intake_Record.docx
@@ -470,7 +470,7 @@
             </w:pPr>
             <w:r>
               <w:rPr/>
-              <w:t>Atty. Elijah Thone</w:t>
+              <w:t>Atty. Elijah Thorne</w:t>
             </w:r>
           </w:p>
         </w:tc>
@@ -2889,7 +2889,7 @@
             </w:pPr>
             <w:r>
               <w:rPr/>
-              <w:t>Atty. Elijah Thone, LSH Law Group</w:t>
+              <w:t>Atty. Elijah Thorne, LSH Law Group</w:t>
             </w:r>
           </w:p>
         </w:tc>

</xml_diff>

<commit_message>
John Doe is a passenger and owns no car: the Civic, its PD claim and its rental are Margaret Doe's
The parked 2019 Honda Civic is re-plotted as Margaret Doe's car, on her
Bluewater policy (UM rejected by her). John owns no vehicle and has no
PD or rental claim: the firm assists Margaret under a separate PD-only
engagement, and his complaint, discovery, term sheet and demand carry no
property damage. The UM reasoning is restated for a passenger who owns no
car. Documents, case file, SPEC, course data, slides, scripts, sim, the
Day 5 PD lab and the KC questions follow it; the document audit now fails
any document that gives John the Civic or a PD or rental claim.

Co-Authored-By: Claude Opus 5.5 <noreply@anthropic.com>
Claude-Session: https://claude.ai/code/session_01So6RsHEAxqg1h82DoqaUJQ
</commit_message>
<xml_diff>
--- a/documents/case-flow/intake/RS_03_LSH_CMS_Intake_Record.docx
+++ b/documents/case-flow/intake/RS_03_LSH_CMS_Intake_Record.docx
@@ -2395,7 +2395,7 @@
             </w:pPr>
             <w:r>
               <w:rPr/>
-              <w:t>Client was the front-seat passenger in a 2020 Ford Escape driven by coworker Kevin Alvarez (carpool). The Escape stopped eastbound on Maple Hollow Rd and proceeded. Defendant Robert Smith, northbound on Birch Ave in a 2017 Chevrolet Silverado, failed to stop and struck the Escape's front passenger door, pushing it into client's parked 2019 Honda Civic. Neighbor witness. Doorbell camera at 2214 Maple Hollow Rd faces the intersection.</w:t>
+              <w:t>Client was the front-seat passenger in a 2020 Ford Escape driven by coworker Kevin Alvarez (carpool). The Escape stopped eastbound on Maple Hollow Rd and proceeded. Defendant Robert Smith, northbound on Birch Ave in a 2017 Chevrolet Silverado, failed to stop and struck the Escape's front passenger door, pushing it into the parked 2019 Honda Civic owned by client's mother, Margaret Doe. Neighbor witness. Doorbell camera at 2214 Maple Hollow Rd faces the intersection.</w:t>
             </w:r>
           </w:p>
         </w:tc>
@@ -3104,7 +3104,7 @@
             </w:pPr>
             <w:r>
               <w:rPr/>
-              <w:t>Vehicle 3 — client's own (parked)</w:t>
+              <w:t>Vehicle 3 — parked, unoccupied</w:t>
             </w:r>
           </w:p>
         </w:tc>
@@ -3128,7 +3128,7 @@
             </w:pPr>
             <w:r>
               <w:rPr/>
-              <w:t>2019 Honda Civic LX · owner John Doe · Bluewater Auto Insurance · towed from scene</w:t>
+              <w:t>2019 Honda Civic LX · owner Margaret Doe (client's mother) · Bluewater Auto Insurance · towed from scene</w:t>
             </w:r>
           </w:p>
         </w:tc>
@@ -3292,7 +3292,7 @@
             </w:pPr>
             <w:r>
               <w:rPr/>
-              <w:t>Property damage — client's Civic</w:t>
+              <w:t>Property damage — Margaret Doe's Civic (not the client's claim)</w:t>
             </w:r>
           </w:p>
         </w:tc>
@@ -3316,7 +3316,7 @@
             </w:pPr>
             <w:r>
               <w:rPr/>
-              <w:t>Keystone Mutual Insurance · claim KM-26-440871-PD · adjuster Leah Moran</w:t>
+              <w:t>Keystone Mutual Insurance · claim KM-26-440871-PD · adjuster Leah Moran · claimant Margaret Doe</w:t>
             </w:r>
           </w:p>
         </w:tc>
@@ -3445,7 +3445,7 @@
             </w:pPr>
             <w:r>
               <w:rPr/>
-              <w:t>Client's own policy</w:t>
+              <w:t>Margaret's policy on the Civic</w:t>
             </w:r>
           </w:p>
         </w:tc>
@@ -3469,7 +3469,7 @@
             </w:pPr>
             <w:r>
               <w:rPr/>
-              <w:t>Bluewater Auto Insurance · policy BWA-209-66184 · UM/UIM status unknown (client unsure)</w:t>
+              <w:t>Bluewater Auto Insurance · policy BWA-209-66184 · UM/UIM status unknown (Margaret unsure) · the client owns no vehicle and has no auto policy</w:t>
             </w:r>
           </w:p>
         </w:tc>
@@ -4151,7 +4151,7 @@
             </w:pPr>
             <w:r>
               <w:rPr/>
-              <w:t>Client has no vehicle; no rental</w:t>
+              <w:t>Client owns no vehicle; rides with Kevin (carpool) or Margaret</w:t>
             </w:r>
           </w:p>
         </w:tc>

</xml_diff>